<commit_message>
DSE Ex-5/6/7: readable wide tables, and fix a contradicting Ex-5 caption
to_string() ignores display.width, so the 15-17 column head/tail dumps came
out as one 226-char line that labshot hard-wrapped mid-value - Ex-6's Class
column ended up split across three physical lines. Plain print() lets pandas
wrap into labelled blocks instead.

Ex-5 printed "Best R2: Polynomial" and then captioned a multiple-linear plot
"the best model". The two differ by 0.0003, so the heading now names the
model it actually plots.

Co-Authored-By: Claude Opus 5 <noreply@anthropic.com>
Claude-Session: https://claude.ai/code/session_0181xcfdvdg7GfG6hCLBeQ1r
</commit_message>
<xml_diff>
--- a/Subjects/DSE/output/Ex5/Ex5_URK24CS1021.docx
+++ b/Subjects/DSE/output/Ex5/Ex5_URK24CS1021.docx
@@ -351,7 +351,7 @@
           <w:color w:val="202020"/>
           <w:sz w:val="20"/>
         </w:rPr>
-        <w:t>print(df.head(10).to_string())</w:t>
+        <w:t>print(df.head(10))</w:t>
       </w:r>
     </w:p>
     <w:p>
@@ -375,7 +375,7 @@
       <w:r>
         <w:drawing>
           <wp:inline xmlns:a="http://schemas.openxmlformats.org/drawingml/2006/main" xmlns:pic="http://schemas.openxmlformats.org/drawingml/2006/picture">
-            <wp:extent cx="5669280" cy="2914010"/>
+            <wp:extent cx="5669280" cy="4240621"/>
             <wp:docPr id="2" name="Picture 2"/>
             <wp:cNvGraphicFramePr>
               <a:graphicFrameLocks noChangeAspect="1"/>
@@ -396,7 +396,7 @@
                   <pic:spPr>
                     <a:xfrm>
                       <a:off x="0" y="0"/>
-                      <a:ext cx="5669280" cy="2914010"/>
+                      <a:ext cx="5669280" cy="4240621"/>
                     </a:xfrm>
                     <a:prstGeom prst="rect"/>
                   </pic:spPr>
@@ -432,7 +432,7 @@
           <w:color w:val="202020"/>
           <w:sz w:val="20"/>
         </w:rPr>
-        <w:t>print(df.tail(8).to_string())</w:t>
+        <w:t>print(df.tail(8))</w:t>
       </w:r>
     </w:p>
     <w:p>
@@ -456,7 +456,7 @@
       <w:r>
         <w:drawing>
           <wp:inline xmlns:a="http://schemas.openxmlformats.org/drawingml/2006/main" xmlns:pic="http://schemas.openxmlformats.org/drawingml/2006/picture">
-            <wp:extent cx="5669280" cy="2505822"/>
+            <wp:extent cx="5669280" cy="3628339"/>
             <wp:docPr id="3" name="Picture 3"/>
             <wp:cNvGraphicFramePr>
               <a:graphicFrameLocks noChangeAspect="1"/>
@@ -477,7 +477,7 @@
                   <pic:spPr>
                     <a:xfrm>
                       <a:off x="0" y="0"/>
-                      <a:ext cx="5669280" cy="2505822"/>
+                      <a:ext cx="5669280" cy="3628339"/>
                     </a:xfrm>
                     <a:prstGeom prst="rect"/>
                   </pic:spPr>
@@ -810,7 +810,7 @@
           <w:color w:val="202020"/>
           <w:sz w:val="20"/>
         </w:rPr>
-        <w:t>print(df.describe().to_string())</w:t>
+        <w:t>print(df.describe())</w:t>
         <w:br/>
       </w:r>
       <w:r>
@@ -2608,7 +2608,7 @@
           <w:b/>
           <w:sz w:val="24"/>
         </w:rPr>
-        <w:t>Sample Code: 17. Predicted vs actual for the best model</w:t>
+        <w:t>Sample Code: 17. Predicted vs actual for the multiple linear model</w:t>
       </w:r>
     </w:p>
     <w:p>
@@ -2617,6 +2617,24 @@
         <w:ind w:left="216"/>
         <w:shd w:val="clear" w:color="auto" w:fill="F2F2F2"/>
       </w:pPr>
+      <w:r>
+        <w:rPr>
+          <w:rFonts w:ascii="Consolas" w:hAnsi="Consolas" w:cs="Consolas"/>
+          <w:color w:val="202020"/>
+          <w:sz w:val="20"/>
+        </w:rPr>
+        <w:t># polynomial edges it on R2 by 0.0003, which is noise - so the plot uses</w:t>
+        <w:br/>
+      </w:r>
+      <w:r>
+        <w:rPr>
+          <w:rFonts w:ascii="Consolas" w:hAnsi="Consolas" w:cs="Consolas"/>
+          <w:color w:val="202020"/>
+          <w:sz w:val="20"/>
+        </w:rPr>
+        <w:t># the plain multiple linear model, the simplest of the ones that tied</w:t>
+        <w:br/>
+      </w:r>
       <w:r>
         <w:rPr>
           <w:rFonts w:ascii="Consolas" w:hAnsi="Consolas" w:cs="Consolas"/>

</xml_diff>